<commit_message>
vin biere et spirtueux v2
</commit_message>
<xml_diff>
--- a/docs/visites-guidees/vin-biere-alcool.docx
+++ b/docs/visites-guidees/vin-biere-alcool.docx
@@ -5,24 +5,12 @@
     <w:p>
       <w:pPr>
         <w:ind w:left="1416" w:firstLine="708"/>
-        <w:rPr>
-          <w:b/>
-          <w:bCs/>
-        </w:rPr>
-      </w:pPr>
-      <w:r>
-        <w:rPr>
-          <w:b/>
-          <w:bCs/>
-        </w:rPr>
+      </w:pPr>
+      <w:r>
         <w:t xml:space="preserve">Vins, bière et </w:t>
       </w:r>
       <w:proofErr w:type="spellStart"/>
       <w:r>
-        <w:rPr>
-          <w:b/>
-          <w:bCs/>
-        </w:rPr>
         <w:t>spirituex</w:t>
       </w:r>
       <w:proofErr w:type="spellEnd"/>
@@ -288,8 +276,13 @@
         </w:numPr>
         <w:jc w:val="both"/>
       </w:pPr>
-      <w:r>
-        <w:t xml:space="preserve">la société </w:t>
+      <w:proofErr w:type="gramStart"/>
+      <w:r>
+        <w:t>la</w:t>
+      </w:r>
+      <w:proofErr w:type="gramEnd"/>
+      <w:r>
+        <w:t xml:space="preserve"> société </w:t>
       </w:r>
       <w:proofErr w:type="spellStart"/>
       <w:r>
@@ -630,15 +623,18 @@
       </w:r>
     </w:p>
     <w:p>
-      <w:r>
-        <w:rPr>
-          <w:b/>
-          <w:bCs/>
-        </w:rPr>
-        <w:t>Les vins rouges</w:t>
-      </w:r>
-      <w:r>
-        <w:t xml:space="preserve"> : </w:t>
+      <w:pPr>
+        <w:rPr>
+          <w:b/>
+          <w:bCs/>
+        </w:rPr>
+      </w:pPr>
+      <w:r>
+        <w:rPr>
+          <w:b/>
+          <w:bCs/>
+        </w:rPr>
+        <w:t xml:space="preserve">Les vins rouges : </w:t>
       </w:r>
     </w:p>
     <w:p>
@@ -649,9 +645,11 @@
           <w:numId w:val="1"/>
         </w:numPr>
       </w:pPr>
+      <w:proofErr w:type="gramStart"/>
       <w:r>
         <w:t>un</w:t>
       </w:r>
+      <w:proofErr w:type="gramEnd"/>
       <w:r>
         <w:rPr>
           <w:b/>
@@ -688,10 +686,7 @@
         <w:t xml:space="preserve"> (cépage local, léger, fruité, un peu façon pinot noir</w:t>
       </w:r>
       <w:r>
-        <w:t>, c</w:t>
-      </w:r>
-      <w:r>
-        <w:t xml:space="preserve">’est probablement le rouge turc le plus facile à apprécier pour un palais français : fruité, assez souple, avec une belle fraîcheur, plutôt sur les fruits rouges. Il accompagne très bien les grillades, le kebab, les viandes en sauce et les plats turcs. </w:t>
+        <w:t xml:space="preserve">, c’est probablement le rouge turc le plus facile à apprécier pour un palais français : fruité, assez souple, avec une belle fraîcheur, plutôt sur les fruits rouges. Il accompagne très bien les grillades, le kebab, les viandes en sauce et les plats turcs. </w:t>
       </w:r>
     </w:p>
     <w:p>
@@ -703,10 +698,7 @@
         </w:numPr>
       </w:pPr>
       <w:r>
-        <w:t>Ensuite</w:t>
-      </w:r>
-      <w:r>
-        <w:t>,</w:t>
+        <w:t>Ensuite,</w:t>
       </w:r>
       <w:r>
         <w:rPr>
@@ -851,10 +843,7 @@
         <w:t>Emir</w:t>
       </w:r>
       <w:r>
-        <w:t xml:space="preserve">. </w:t>
-      </w:r>
-      <w:r>
-        <w:t xml:space="preserve">C'est un cépage originaire de Cappadoce, donnant un blanc </w:t>
+        <w:t xml:space="preserve">. C'est un cépage originaire de Cappadoce, donnant un blanc </w:t>
       </w:r>
       <w:r>
         <w:rPr>
@@ -906,13 +895,7 @@
         <w:t>E</w:t>
       </w:r>
       <w:r>
-        <w:t>n Cappadoce,</w:t>
-      </w:r>
-      <w:r>
-        <w:t xml:space="preserve"> il faut</w:t>
-      </w:r>
-      <w:r>
-        <w:t xml:space="preserve"> </w:t>
+        <w:t xml:space="preserve">n Cappadoce, il faut </w:t>
       </w:r>
       <w:r>
         <w:rPr>
@@ -1046,6 +1029,11 @@
       <w:r>
         <w:t>est également un rosé turc classique.</w:t>
       </w:r>
+    </w:p>
+    <w:p>
+      <w:pPr>
+        <w:pStyle w:val="Paragraphedeliste"/>
+      </w:pPr>
     </w:p>
     <w:tbl>
       <w:tblPr>
@@ -1082,16 +1070,8 @@
           <w:p>
             <w:pPr>
               <w:jc w:val="center"/>
-              <w:rPr>
-                <w:b/>
-                <w:bCs/>
-              </w:rPr>
             </w:pPr>
             <w:r>
-              <w:rPr>
-                <w:b/>
-                <w:bCs/>
-              </w:rPr>
               <w:t>Si tu veux...</w:t>
             </w:r>
           </w:p>
@@ -1109,16 +1089,8 @@
           <w:p>
             <w:pPr>
               <w:jc w:val="center"/>
-              <w:rPr>
-                <w:b/>
-                <w:bCs/>
-              </w:rPr>
             </w:pPr>
             <w:r>
-              <w:rPr>
-                <w:b/>
-                <w:bCs/>
-              </w:rPr>
               <w:t>Prends...</w:t>
             </w:r>
           </w:p>
@@ -1135,16 +1107,8 @@
           <w:p>
             <w:pPr>
               <w:jc w:val="center"/>
-              <w:rPr>
-                <w:b/>
-                <w:bCs/>
-              </w:rPr>
             </w:pPr>
             <w:r>
-              <w:rPr>
-                <w:b/>
-                <w:bCs/>
-              </w:rPr>
               <w:t>Style</w:t>
             </w:r>
           </w:p>
@@ -1469,6 +1433,7 @@
         <w:rPr>
           <w:b/>
           <w:bCs/>
+          <w:noProof/>
         </w:rPr>
         <w:lastRenderedPageBreak/>
         <w:drawing>
@@ -1762,6 +1727,9 @@
         <w:jc w:val="center"/>
       </w:pPr>
       <w:r>
+        <w:rPr>
+          <w:noProof/>
+        </w:rPr>
         <w:lastRenderedPageBreak/>
         <w:drawing>
           <wp:inline distT="0" distB="0" distL="0" distR="0" wp14:anchorId="1C1155D7" wp14:editId="22C0C37E">
@@ -2802,6 +2770,7 @@
   <w:style w:type="character" w:default="1" w:styleId="Policepardfaut">
     <w:name w:val="Default Paragraph Font"/>
     <w:uiPriority w:val="1"/>
+    <w:semiHidden/>
     <w:unhideWhenUsed/>
   </w:style>
   <w:style w:type="table" w:default="1" w:styleId="TableauNormal">

</xml_diff>